<commit_message>
Remove em/en dashes from page, scripts, PPTX, sample docx files; rebuild zip
Co-authored-by: Copilot <223556219+Copilot@users.noreply.github.com>
</commit_message>
<xml_diff>
--- a/samples/02 ContosoPower_Procurement_Meeting_Transcript.docx
+++ b/samples/02 ContosoPower_Procurement_Meeting_Transcript.docx
@@ -7,7 +7,7 @@
         <w:pStyle w:val="Title"/>
       </w:pPr>
       <w:r>
-        <w:t>Procurement Committee — Vendor Evaluation Meeting</w:t>
+        <w:t>Procurement Committee - Vendor Evaluation Meeting</w:t>
       </w:r>
     </w:p>
     <w:p>
@@ -21,7 +21,7 @@
     </w:p>
     <w:p>
       <w:r>
-        <w:t>Date: 12 May 2026  |  Time: 14:00 – 14:45  |  Location: HQ Boardroom B</w:t>
+        <w:t>Date: 12 May 2026  |  Time: 14:00 - 14:45  |  Location: HQ Boardroom B</w:t>
       </w:r>
     </w:p>
     <w:p>
@@ -31,7 +31,7 @@
     </w:p>
     <w:p>
       <w:r>
-        <w:t>Scope: Boiler tube replacement contract for TBE-1 — RM 18.4M, 14-month delivery. Three vendors shortlisted from RFP-2026-031.</w:t>
+        <w:t>Scope: Boiler tube replacement contract for TBE-1 - RM 18.4M, 14-month delivery. Three vendors shortlisted from RFP-2026-031.</w:t>
       </w:r>
     </w:p>
     <w:p>
@@ -83,7 +83,7 @@
         <w:t xml:space="preserve">Nora: </w:t>
       </w:r>
       <w:r>
-        <w:t>Two flags from legal. Pacific's parent guarantee is from a Singapore subsidiary that does not consolidate up — we'd want a corporate guarantee from the listed entity. Sumitec's draft contract is acceptable subject to indemnity cap adjustment from 50 percent to 100 percent of contract value.</w:t>
+        <w:t>Two flags from legal. Pacific's parent guarantee is from a Singapore subsidiary that does not consolidate up - we'd want a corporate guarantee from the listed entity. Sumitec's draft contract is acceptable subject to indemnity cap adjustment from 50 percent to 100 percent of contract value.</w:t>
       </w:r>
     </w:p>
     <w:p>
@@ -116,7 +116,7 @@
         <w:t xml:space="preserve">Rajiv: </w:t>
       </w:r>
       <w:r>
-        <w:t>Two prior projects with Pacific had quality non-conformance — we issued NCRs in 2023 and 2024 on weld quality. They did remediate but it took six and nine weeks respectively.</w:t>
+        <w:t>Two prior projects with Pacific had quality non-conformance - we issued NCRs in 2023 and 2024 on weld quality. They did remediate but it took six and nine weeks respectively.</w:t>
       </w:r>
     </w:p>
     <w:p>
@@ -160,7 +160,7 @@
         <w:t xml:space="preserve">Daniel: </w:t>
       </w:r>
       <w:r>
-        <w:t>PMO supports — fits the 2027 outage window with margin.</w:t>
+        <w:t>PMO supports - fits the 2027 outage window with margin.</w:t>
       </w:r>
     </w:p>
     <w:p>

</xml_diff>